<commit_message>
Giulia (Pedemonte): compenso oltre IVA, clausola furto non coperto, mail per la nuova firma
Co-Authored-By: Claude Opus 5.5 <noreply@anthropic.com>
Claude-Session: https://claude.ai/code/session_01WggD5zVqy5TCJTD9M5VXmn
</commit_message>
<xml_diff>
--- a/contratti/clienti_privati/Contratto_BB_Hospitality_Giulia_Pedemonte.docx
+++ b/contratti/clienti_privati/Contratto_BB_Hospitality_Giulia_Pedemonte.docx
@@ -2341,7 +2341,7 @@
         <w:jc w:val="both"/>
       </w:pPr>
       <w:r>
-        <w:t xml:space="preserve">Per l’attività di gestione e per i servizi di cui all’art. 2, al Property Manager spetta un compenso pari al 20% (venti per cento) del Costo del Pernottamento di ciascuna prenotazione. Per “Costo del Pernottamento” si intende il prezzo dei pernottamenti dovuto dall’Ospite, come risultante dalla prenotazione, al netto delle commissioni trattenute dalle piattaforme di prenotazione e delle spese di pulizia relative al soggiorno, ed esclusi l’imposta di soggiorno, l’eventuale deposito cauzionale e le commissioni di servizio addebitate all’Ospite dalle piattaforme.</w:t>
+        <w:t xml:space="preserve">Per l’attività di gestione e per i servizi di cui all’art. 2, al Property Manager spetta un compenso pari al 20% (venti per cento) del Costo del Pernottamento di ciascuna prenotazione, oltre IVA. Per “Costo del Pernottamento” si intende il prezzo dei pernottamenti dovuto dall’Ospite, come risultante dalla prenotazione, al netto delle commissioni trattenute dalle piattaforme di prenotazione e delle spese di pulizia relative al soggiorno, ed esclusi l’imposta di soggiorno, l’eventuale deposito cauzionale e le commissioni di servizio addebitate all’Ospite dalle piattaforme.</w:t>
       </w:r>
     </w:p>
     <w:p>
@@ -2914,7 +2914,7 @@
         <w:jc w:val="both"/>
       </w:pPr>
       <w:r>
-        <w:t xml:space="preserve">Il Mandante dichiara di avere stipulato adeguata polizza assicurativa, con primaria compagnia, a copertura dei rischi di incendio (fabbricato e contenuto), furto, responsabilità civile verso i conduttori e verso terzi, che viene allegata al presente contratto (allegato d).</w:t>
+        <w:t xml:space="preserve">Il Mandante dichiara di avere stipulato polizza assicurativa con primaria compagnia, a copertura dei rischi di incendio (fabbricato e contenuto) e di responsabilità civile verso terzi, con estensione all’attività di ospitalità, che viene allegata al presente contratto (allegato d). La polizza non comprende la copertura del rischio furto: il Property Manager ne prende atto e il Mandante si assume ogni rischio e conseguenza derivante da furti o sottrazioni di beni presenti nell’Immobile, sollevando il Property Manager da ogni responsabilità al riguardo, salvo il caso di furto imputabile a dolo o colpa grave del Property Manager o del personale da esso incaricato.</w:t>
       </w:r>
     </w:p>
     <w:p>
@@ -3048,7 +3048,7 @@
         <w:jc w:val="both"/>
       </w:pPr>
       <w:r>
-        <w:t xml:space="preserve">A fronte dell’attività di promozione e acquisizione svolta, per le Prenotazioni Future il Mandante riconosce al Property Manager un compenso forfettario (il “Compenso di Fine Mandato”) pari al 30% (trenta per cento) del compenso che sarebbe spettato al Property Manager ai sensi dell’art. 11 sul Costo del Pernottamento relativo ai pernottamenti successivi alla data di cessazione.</w:t>
+        <w:t xml:space="preserve">A fronte dell’attività di promozione e acquisizione svolta, per le Prenotazioni Future il Mandante riconosce al Property Manager un compenso forfettario (il “Compenso di Fine Mandato”) pari al 30% (trenta per cento) del compenso che sarebbe spettato al Property Manager ai sensi dell’art. 11 sul Costo del Pernottamento relativo ai pernottamenti successivi alla data di cessazione, oltre IVA.</w:t>
       </w:r>
     </w:p>
     <w:p>

</xml_diff>